<commit_message>
fix lab8, lab9, init lab10
</commit_message>
<xml_diff>
--- a/sem2/lab8/RIS-25-2B-Ilinov-lab8-otchet.docx
+++ b/sem2/lab8/RIS-25-2B-Ilinov-lab8-otchet.docx
@@ -220,7 +220,18 @@
           <w:szCs w:val="24"/>
           <w:lang w:val="ru-RU"/>
         </w:rPr>
-        <w:t>Лабораторная работа №7</w:t>
+        <w:t>Лабораторная работа №</w:t>
+      </w:r>
+      <w:r>
+        <w:rPr>
+          <w:rFonts w:cs="Times New Roman" w:ascii="Times New Roman" w:hAnsi="Times New Roman"/>
+          <w:b/>
+          <w:bCs/>
+          <w:sz w:val="24"/>
+          <w:szCs w:val="24"/>
+          <w:lang w:val="ru-RU"/>
+        </w:rPr>
+        <w:t>8</w:t>
       </w:r>
     </w:p>
     <w:p>
@@ -300,16 +311,7 @@
           <w:szCs w:val="24"/>
           <w:lang w:val="ru-RU"/>
         </w:rPr>
-        <w:t xml:space="preserve">Вариант </w:t>
-      </w:r>
-      <w:r>
-        <w:rPr>
-          <w:rFonts w:cs="Times New Roman" w:ascii="Times New Roman" w:hAnsi="Times New Roman"/>
-          <w:sz w:val="24"/>
-          <w:szCs w:val="24"/>
-          <w:lang w:val="ru-RU"/>
-        </w:rPr>
-        <w:t>24</w:t>
+        <w:t>Вариант 24</w:t>
       </w:r>
     </w:p>
     <w:p>
@@ -1008,6 +1010,7 @@
     <w:p>
       <w:pPr>
         <w:pStyle w:val="Normal"/>
+        <w:spacing w:before="0" w:after="160"/>
         <w:ind w:firstLine="709"/>
         <w:jc w:val="center"/>
         <w:rPr>
@@ -1019,13 +1022,6 @@
         </w:rPr>
       </w:pPr>
       <w:r>
-        <w:rPr>
-          <w:rFonts w:eastAsia="Times New Roman" w:cs="Times New Roman" w:ascii="Times New Roman" w:hAnsi="Times New Roman"/>
-          <w:iCs/>
-          <w:sz w:val="24"/>
-          <w:szCs w:val="24"/>
-          <w:lang w:val="ru-RU"/>
-        </w:rPr>
         <w:drawing>
           <wp:anchor distT="0" distB="0" distL="0" distR="0" simplePos="0" relativeHeight="2" behindDoc="0" locked="0" layoutInCell="0" allowOverlap="1">
             <wp:simplePos x="0" y="0"/>
@@ -1090,6 +1086,7 @@
     <w:p>
       <w:pPr>
         <w:pStyle w:val="Normal"/>
+        <w:spacing w:before="0" w:after="160"/>
         <w:ind w:firstLine="709"/>
         <w:jc w:val="center"/>
         <w:rPr>
@@ -1124,13 +1121,6 @@
         </w:rPr>
       </w:pPr>
       <w:r>
-        <w:rPr>
-          <w:rFonts w:eastAsia="Times New Roman" w:cs="Times New Roman" w:ascii="Times New Roman" w:hAnsi="Times New Roman"/>
-          <w:iCs/>
-          <w:sz w:val="24"/>
-          <w:szCs w:val="24"/>
-          <w:lang w:val="ru-RU"/>
-        </w:rPr>
         <w:drawing>
           <wp:anchor distT="0" distB="0" distL="0" distR="0" simplePos="0" relativeHeight="3" behindDoc="0" locked="0" layoutInCell="0" allowOverlap="1">
             <wp:simplePos x="0" y="0"/>
@@ -1287,6 +1277,7 @@
     <w:p>
       <w:pPr>
         <w:pStyle w:val="Normal"/>
+        <w:spacing w:before="0" w:after="160"/>
         <w:ind w:firstLine="709"/>
         <w:jc w:val="center"/>
         <w:rPr>
@@ -1383,6 +1374,7 @@
     <w:p>
       <w:pPr>
         <w:pStyle w:val="Normal"/>
+        <w:spacing w:before="0" w:after="160"/>
         <w:ind w:firstLine="709"/>
         <w:jc w:val="center"/>
         <w:rPr>
@@ -1407,8 +1399,7 @@
     <w:p>
       <w:pPr>
         <w:pStyle w:val="Normal"/>
-        <w:pBdr/>
-        <w:shd w:fill="FFFFFF" w:val="clear"/>
+        <w:shd w:val="clear" w:fill="FFFFFF"/>
         <w:rPr>
           <w:rFonts w:ascii="JetBrains Mono" w:hAnsi="JetBrains Mono"/>
           <w:b w:val="false"/>
@@ -4855,6 +4846,7 @@
     <w:p>
       <w:pPr>
         <w:pStyle w:val="Normal"/>
+        <w:spacing w:before="0" w:after="160"/>
         <w:ind w:firstLine="709"/>
         <w:jc w:val="center"/>
         <w:rPr>
@@ -4903,8 +4895,7 @@
     <w:p>
       <w:pPr>
         <w:pStyle w:val="Normal"/>
-        <w:pBdr/>
-        <w:shd w:fill="FFFFFF" w:val="clear"/>
+        <w:shd w:val="clear" w:fill="FFFFFF"/>
         <w:rPr>
           <w:rFonts w:ascii="JetBrains Mono" w:hAnsi="JetBrains Mono"/>
           <w:b w:val="false"/>
@@ -5027,6 +5018,7 @@
     <w:p>
       <w:pPr>
         <w:pStyle w:val="Normal"/>
+        <w:spacing w:before="0" w:after="160"/>
         <w:ind w:firstLine="709"/>
         <w:jc w:val="left"/>
         <w:rPr>
@@ -5048,8 +5040,7 @@
     <w:p>
       <w:pPr>
         <w:pStyle w:val="Normal"/>
-        <w:pBdr/>
-        <w:shd w:fill="FFFFFF" w:val="clear"/>
+        <w:shd w:val="clear" w:fill="FFFFFF"/>
         <w:rPr>
           <w:rFonts w:ascii="JetBrains Mono" w:hAnsi="JetBrains Mono"/>
           <w:b w:val="false"/>
@@ -5165,6 +5156,7 @@
         </w:tabs>
         <w:ind w:left="0" w:hanging="0"/>
       </w:pPr>
+      <w:rPr/>
     </w:lvl>
     <w:lvl w:ilvl="1">
       <w:start w:val="1"/>
@@ -5178,6 +5170,7 @@
         </w:tabs>
         <w:ind w:left="0" w:hanging="0"/>
       </w:pPr>
+      <w:rPr/>
     </w:lvl>
     <w:lvl w:ilvl="2">
       <w:start w:val="1"/>
@@ -5191,6 +5184,7 @@
         </w:tabs>
         <w:ind w:left="0" w:hanging="0"/>
       </w:pPr>
+      <w:rPr/>
     </w:lvl>
     <w:lvl w:ilvl="3">
       <w:start w:val="1"/>
@@ -5204,6 +5198,7 @@
         </w:tabs>
         <w:ind w:left="0" w:hanging="0"/>
       </w:pPr>
+      <w:rPr/>
     </w:lvl>
     <w:lvl w:ilvl="4">
       <w:start w:val="1"/>
@@ -5217,6 +5212,7 @@
         </w:tabs>
         <w:ind w:left="0" w:hanging="0"/>
       </w:pPr>
+      <w:rPr/>
     </w:lvl>
     <w:lvl w:ilvl="5">
       <w:start w:val="1"/>
@@ -5230,6 +5226,7 @@
         </w:tabs>
         <w:ind w:left="0" w:hanging="0"/>
       </w:pPr>
+      <w:rPr/>
     </w:lvl>
     <w:lvl w:ilvl="6">
       <w:start w:val="1"/>
@@ -5243,6 +5240,7 @@
         </w:tabs>
         <w:ind w:left="0" w:hanging="0"/>
       </w:pPr>
+      <w:rPr/>
     </w:lvl>
     <w:lvl w:ilvl="7">
       <w:start w:val="1"/>
@@ -5256,6 +5254,7 @@
         </w:tabs>
         <w:ind w:left="0" w:hanging="0"/>
       </w:pPr>
+      <w:rPr/>
     </w:lvl>
     <w:lvl w:ilvl="8">
       <w:start w:val="1"/>
@@ -5269,6 +5268,7 @@
         </w:tabs>
         <w:ind w:left="0" w:hanging="0"/>
       </w:pPr>
+      <w:rPr/>
     </w:lvl>
   </w:abstractNum>
   <w:abstractNum w:abstractNumId="2">
@@ -5284,7 +5284,6 @@
         </w:tabs>
         <w:ind w:left="0" w:hanging="0"/>
       </w:pPr>
-      <w:rPr/>
     </w:lvl>
     <w:lvl w:ilvl="1">
       <w:start w:val="1"/>
@@ -5298,7 +5297,6 @@
         </w:tabs>
         <w:ind w:left="0" w:hanging="0"/>
       </w:pPr>
-      <w:rPr/>
     </w:lvl>
     <w:lvl w:ilvl="2">
       <w:start w:val="1"/>
@@ -5312,7 +5310,6 @@
         </w:tabs>
         <w:ind w:left="0" w:hanging="0"/>
       </w:pPr>
-      <w:rPr/>
     </w:lvl>
     <w:lvl w:ilvl="3">
       <w:start w:val="1"/>
@@ -5326,7 +5323,6 @@
         </w:tabs>
         <w:ind w:left="0" w:hanging="0"/>
       </w:pPr>
-      <w:rPr/>
     </w:lvl>
     <w:lvl w:ilvl="4">
       <w:start w:val="1"/>
@@ -5340,7 +5336,6 @@
         </w:tabs>
         <w:ind w:left="0" w:hanging="0"/>
       </w:pPr>
-      <w:rPr/>
     </w:lvl>
     <w:lvl w:ilvl="5">
       <w:start w:val="1"/>
@@ -5354,7 +5349,6 @@
         </w:tabs>
         <w:ind w:left="0" w:hanging="0"/>
       </w:pPr>
-      <w:rPr/>
     </w:lvl>
     <w:lvl w:ilvl="6">
       <w:start w:val="1"/>
@@ -5368,7 +5362,6 @@
         </w:tabs>
         <w:ind w:left="0" w:hanging="0"/>
       </w:pPr>
-      <w:rPr/>
     </w:lvl>
     <w:lvl w:ilvl="7">
       <w:start w:val="1"/>
@@ -5382,7 +5375,6 @@
         </w:tabs>
         <w:ind w:left="0" w:hanging="0"/>
       </w:pPr>
-      <w:rPr/>
     </w:lvl>
     <w:lvl w:ilvl="8">
       <w:start w:val="1"/>
@@ -5396,7 +5388,6 @@
         </w:tabs>
         <w:ind w:left="0" w:hanging="0"/>
       </w:pPr>
-      <w:rPr/>
     </w:lvl>
   </w:abstractNum>
   <w:num w:numId="1">
@@ -5831,7 +5822,7 @@
     <w:pPr>
       <w:numPr>
         <w:ilvl w:val="0"/>
-        <w:numId w:val="2"/>
+        <w:numId w:val="1"/>
       </w:numPr>
       <w:spacing w:before="240" w:after="120"/>
       <w:outlineLvl w:val="0"/>

</xml_diff>